<commit_message>
feat: implementar script poblador para el Dashboard interactivo de Langfuse Cloud (Marcelo Gilardoni)
</commit_message>
<xml_diff>
--- a/Inicio de Aplicacion- Demostracion.docx
+++ b/Inicio de Aplicacion- Demostracion.docx
@@ -244,6 +244,7 @@
       </w:pPr>
       <w:r>
         <w:rPr>
+          <w:noProof/>
           <w:lang w:val="en-US"/>
         </w:rPr>
         <w:drawing>
@@ -291,6 +292,7 @@
       </w:pPr>
       <w:r>
         <w:rPr>
+          <w:noProof/>
           <w:lang w:val="en-US"/>
         </w:rPr>
         <w:lastRenderedPageBreak/>
@@ -348,68 +350,16 @@
           <w:sz w:val="28"/>
           <w:szCs w:val="28"/>
         </w:rPr>
-        <w:t>2</w:t>
-      </w:r>
-      <w:r>
-        <w:rPr>
-          <w:b/>
-          <w:bCs/>
-          <w:sz w:val="28"/>
-          <w:szCs w:val="28"/>
-        </w:rPr>
-        <w:t xml:space="preserve"> -</w:t>
-      </w:r>
-      <w:r>
-        <w:rPr>
-          <w:b/>
-          <w:bCs/>
-          <w:sz w:val="28"/>
-          <w:szCs w:val="28"/>
-        </w:rPr>
-        <w:t>SEGUNDA PRUEBA</w:t>
-      </w:r>
-    </w:p>
-    <w:p>
-      <w:pPr>
-        <w:rPr>
-          <w:lang w:val="en-US"/>
-        </w:rPr>
-      </w:pPr>
-    </w:p>
-    <w:p>
-      <w:pPr>
-        <w:rPr>
-          <w:lang w:val="en-US"/>
-        </w:rPr>
-      </w:pPr>
-      <w:proofErr w:type="spellStart"/>
-      <w:r>
-        <w:rPr>
-          <w:lang w:val="en-US"/>
-        </w:rPr>
-        <w:t>Autorizando</w:t>
-      </w:r>
-      <w:proofErr w:type="spellEnd"/>
-      <w:r>
-        <w:rPr>
-          <w:lang w:val="en-US"/>
-        </w:rPr>
-        <w:t xml:space="preserve"> con A-API-KEY: </w:t>
-      </w:r>
-      <w:r>
-        <w:rPr>
-          <w:lang w:val="en-US"/>
-        </w:rPr>
-        <w:t>trading-secret-key-123</w:t>
-      </w:r>
-    </w:p>
-    <w:p>
-      <w:pPr>
-        <w:rPr>
-          <w:lang w:val="en-US"/>
-        </w:rPr>
-      </w:pPr>
-    </w:p>
+        <w:t>2 -SEGUNDA PRUEBA</w:t>
+      </w:r>
+    </w:p>
+    <w:p/>
+    <w:p>
+      <w:r>
+        <w:t>Autorizando con A-API-KEY: trading-secret-key-123</w:t>
+      </w:r>
+    </w:p>
+    <w:p/>
     <w:p>
       <w:pPr>
         <w:rPr>
@@ -431,6 +381,7 @@
       </w:pPr>
       <w:r>
         <w:rPr>
+          <w:noProof/>
           <w:lang w:val="en-US"/>
         </w:rPr>
         <w:drawing>
@@ -489,14 +440,7 @@
           <w:b/>
           <w:bCs/>
         </w:rPr>
-        <w:t>1</w:t>
-      </w:r>
-      <w:r>
-        <w:rPr>
-          <w:b/>
-          <w:bCs/>
-        </w:rPr>
-        <w:t xml:space="preserve"> Verificación de los Cálculos Matemáticos del Adaptador</w:t>
+        <w:t>1 Verificación de los Cálculos Matemáticos del Adaptador</w:t>
       </w:r>
     </w:p>
     <w:p>
@@ -964,18 +908,9 @@
           <w:sz w:val="28"/>
           <w:szCs w:val="28"/>
         </w:rPr>
-        <w:t>mock_</w:t>
-      </w:r>
-      <w:proofErr w:type="gramStart"/>
-      <w:r>
-        <w:rPr>
-          <w:sz w:val="28"/>
-          <w:szCs w:val="28"/>
-        </w:rPr>
-        <w:t>db.json</w:t>
-      </w:r>
-      <w:proofErr w:type="spellEnd"/>
-      <w:proofErr w:type="gramEnd"/>
+        <w:t>mock_db.json</w:t>
+      </w:r>
+      <w:proofErr w:type="spellEnd"/>
       <w:r>
         <w:rPr>
           <w:sz w:val="28"/>
@@ -1004,18 +939,9 @@
           <w:sz w:val="28"/>
           <w:szCs w:val="28"/>
         </w:rPr>
-        <w:t>mock_</w:t>
-      </w:r>
-      <w:proofErr w:type="gramStart"/>
-      <w:r>
-        <w:rPr>
-          <w:sz w:val="28"/>
-          <w:szCs w:val="28"/>
-        </w:rPr>
-        <w:t>db.json</w:t>
-      </w:r>
-      <w:proofErr w:type="spellEnd"/>
-      <w:proofErr w:type="gramEnd"/>
+        <w:t>mock_db.json</w:t>
+      </w:r>
+      <w:proofErr w:type="spellEnd"/>
       <w:r>
         <w:rPr>
           <w:sz w:val="28"/>
@@ -1041,136 +967,120 @@
           <w:szCs w:val="28"/>
         </w:rPr>
         <w:lastRenderedPageBreak/>
-        <w:t>3.2</w:t>
-      </w:r>
-      <w:r>
+        <w:t>3.2 Transaccionalidad Estricta y Consistencia (Garantía ACID)</w:t>
+      </w:r>
+    </w:p>
+    <w:p>
+      <w:pPr>
+        <w:rPr>
+          <w:sz w:val="28"/>
+          <w:szCs w:val="28"/>
+        </w:rPr>
+      </w:pPr>
+      <w:r>
+        <w:rPr>
+          <w:sz w:val="28"/>
+          <w:szCs w:val="28"/>
+        </w:rPr>
+        <w:t>En un sistema financiero o transaccional real, la consistencia de datos es sagrada:</w:t>
+      </w:r>
+    </w:p>
+    <w:p>
+      <w:pPr>
+        <w:rPr>
+          <w:sz w:val="28"/>
+          <w:szCs w:val="28"/>
+        </w:rPr>
+      </w:pPr>
+      <w:r>
+        <w:rPr>
+          <w:sz w:val="28"/>
+          <w:szCs w:val="28"/>
+        </w:rPr>
+        <w:t xml:space="preserve">El problema de otros sistemas: Si tu </w:t>
+      </w:r>
+      <w:proofErr w:type="spellStart"/>
+      <w:r>
+        <w:rPr>
+          <w:sz w:val="28"/>
+          <w:szCs w:val="28"/>
+        </w:rPr>
+        <w:t>backend</w:t>
+      </w:r>
+      <w:proofErr w:type="spellEnd"/>
+      <w:r>
+        <w:rPr>
+          <w:sz w:val="28"/>
+          <w:szCs w:val="28"/>
+        </w:rPr>
+        <w:t xml:space="preserve"> hubiera ignorado el error, el cliente habría recibido su respuesta exitosa de Gemini, pero la empresa nunca habría registrado la operación en su base de datos, creando una frecuente y grave inconsistencia de datos.</w:t>
+      </w:r>
+    </w:p>
+    <w:p>
+      <w:pPr>
+        <w:rPr>
+          <w:sz w:val="28"/>
+          <w:szCs w:val="28"/>
+        </w:rPr>
+      </w:pPr>
+      <w:r>
+        <w:rPr>
+          <w:sz w:val="28"/>
+          <w:szCs w:val="28"/>
+        </w:rPr>
+        <w:t xml:space="preserve">La solución de tu arquitectura: Implementamos un ** </w:t>
+      </w:r>
+      <w:proofErr w:type="spellStart"/>
+      <w:r>
+        <w:rPr>
+          <w:sz w:val="28"/>
+          <w:szCs w:val="28"/>
+        </w:rPr>
+        <w:t>transactional</w:t>
+      </w:r>
+      <w:proofErr w:type="spellEnd"/>
+      <w:r>
+        <w:rPr>
+          <w:sz w:val="28"/>
+          <w:szCs w:val="28"/>
+        </w:rPr>
+        <w:t xml:space="preserve"> </w:t>
+      </w:r>
+      <w:proofErr w:type="spellStart"/>
+      <w:r>
+        <w:rPr>
+          <w:sz w:val="28"/>
+          <w:szCs w:val="28"/>
+        </w:rPr>
+        <w:t>boundary</w:t>
+      </w:r>
+      <w:proofErr w:type="spellEnd"/>
+      <w:r>
+        <w:rPr>
+          <w:sz w:val="28"/>
+          <w:szCs w:val="28"/>
+        </w:rPr>
+        <w:t xml:space="preserve"> (límite transaccional)**. Si la escritura en base de datos falla, el proceso se aborta de inmediato. El sistema interrumpe la ejecución antes de llamar a Gemini 3.5 en Google, ahorrándote costos de tokens innecesarios por una simulación que no se guardará, y le notifica con transparencia al cliente con un código HTTP 503 Service Unavailable para que vuelva a intentar.</w:t>
+      </w:r>
+    </w:p>
+    <w:p>
+      <w:pPr>
         <w:rPr>
           <w:b/>
           <w:bCs/>
           <w:sz w:val="28"/>
           <w:szCs w:val="28"/>
         </w:rPr>
-        <w:t xml:space="preserve"> Transaccionalidad Estricta y Consistencia (Garantía ACID)</w:t>
-      </w:r>
-    </w:p>
-    <w:p>
-      <w:pPr>
-        <w:rPr>
-          <w:sz w:val="28"/>
-          <w:szCs w:val="28"/>
-        </w:rPr>
-      </w:pPr>
-      <w:r>
-        <w:rPr>
-          <w:sz w:val="28"/>
-          <w:szCs w:val="28"/>
-        </w:rPr>
-        <w:t>En un sistema financiero o transaccional real, la consistencia de datos es sagrada:</w:t>
-      </w:r>
-    </w:p>
-    <w:p>
-      <w:pPr>
-        <w:rPr>
-          <w:sz w:val="28"/>
-          <w:szCs w:val="28"/>
-        </w:rPr>
-      </w:pPr>
-      <w:r>
-        <w:rPr>
-          <w:sz w:val="28"/>
-          <w:szCs w:val="28"/>
-        </w:rPr>
-        <w:t xml:space="preserve">El problema de otros sistemas: Si tu </w:t>
-      </w:r>
-      <w:proofErr w:type="spellStart"/>
-      <w:r>
-        <w:rPr>
-          <w:sz w:val="28"/>
-          <w:szCs w:val="28"/>
-        </w:rPr>
-        <w:t>backend</w:t>
-      </w:r>
-      <w:proofErr w:type="spellEnd"/>
-      <w:r>
-        <w:rPr>
-          <w:sz w:val="28"/>
-          <w:szCs w:val="28"/>
-        </w:rPr>
-        <w:t xml:space="preserve"> hubiera ignorado el error, el cliente habría recibido su respuesta exitosa de Gemini, pero la empresa nunca habría registrado la operación en su base de datos, creando una frecuente y grave inconsistencia de datos.</w:t>
-      </w:r>
-    </w:p>
-    <w:p>
-      <w:pPr>
-        <w:rPr>
-          <w:sz w:val="28"/>
-          <w:szCs w:val="28"/>
-        </w:rPr>
-      </w:pPr>
-      <w:r>
-        <w:rPr>
-          <w:sz w:val="28"/>
-          <w:szCs w:val="28"/>
-        </w:rPr>
-        <w:t xml:space="preserve">La solución de tu arquitectura: Implementamos un ** </w:t>
-      </w:r>
-      <w:proofErr w:type="spellStart"/>
-      <w:r>
-        <w:rPr>
-          <w:sz w:val="28"/>
-          <w:szCs w:val="28"/>
-        </w:rPr>
-        <w:t>transactional</w:t>
-      </w:r>
-      <w:proofErr w:type="spellEnd"/>
-      <w:r>
-        <w:rPr>
-          <w:sz w:val="28"/>
-          <w:szCs w:val="28"/>
-        </w:rPr>
-        <w:t xml:space="preserve"> </w:t>
-      </w:r>
-      <w:proofErr w:type="spellStart"/>
-      <w:r>
-        <w:rPr>
-          <w:sz w:val="28"/>
-          <w:szCs w:val="28"/>
-        </w:rPr>
-        <w:t>boundary</w:t>
-      </w:r>
-      <w:proofErr w:type="spellEnd"/>
-      <w:r>
-        <w:rPr>
-          <w:sz w:val="28"/>
-          <w:szCs w:val="28"/>
-        </w:rPr>
-        <w:t xml:space="preserve"> (límite </w:t>
-      </w:r>
-      <w:proofErr w:type="gramStart"/>
-      <w:r>
-        <w:rPr>
-          <w:sz w:val="28"/>
-          <w:szCs w:val="28"/>
-        </w:rPr>
-        <w:t>transaccional)*</w:t>
-      </w:r>
-      <w:proofErr w:type="gramEnd"/>
-      <w:r>
-        <w:rPr>
-          <w:sz w:val="28"/>
-          <w:szCs w:val="28"/>
-        </w:rPr>
-        <w:t>*. Si la escritura en base de datos falla, el proceso se aborta de inmediato. El sistema interrumpe la ejecución antes de llamar a Gemini 3.5 en Google, ahorrándote costos de tokens innecesarios por una simulación que no se guardará, y le notifica con transparencia al cliente con un código HTTP 503 Service Unavailable para que vuelva a intentar.</w:t>
-      </w:r>
-    </w:p>
-    <w:p>
-      <w:pPr>
+      </w:pPr>
+      <w:r>
         <w:rPr>
           <w:b/>
           <w:bCs/>
           <w:sz w:val="28"/>
           <w:szCs w:val="28"/>
         </w:rPr>
-      </w:pPr>
+        <w:t>3</w:t>
+      </w:r>
       <w:r>
         <w:rPr>
           <w:b/>
@@ -1178,7 +1088,7 @@
           <w:sz w:val="28"/>
           <w:szCs w:val="28"/>
         </w:rPr>
-        <w:t>3</w:t>
+        <w:t>.3</w:t>
       </w:r>
       <w:r>
         <w:rPr>
@@ -1187,8 +1097,9 @@
           <w:sz w:val="28"/>
           <w:szCs w:val="28"/>
         </w:rPr>
-        <w:t>.3</w:t>
-      </w:r>
+        <w:t xml:space="preserve"> Diagnóstico Automático en Consola (</w:t>
+      </w:r>
+      <w:proofErr w:type="spellStart"/>
       <w:r>
         <w:rPr>
           <w:b/>
@@ -1196,9 +1107,9 @@
           <w:sz w:val="28"/>
           <w:szCs w:val="28"/>
         </w:rPr>
-        <w:t xml:space="preserve"> Diagnóstico Automático en Consola (</w:t>
-      </w:r>
-      <w:proofErr w:type="spellStart"/>
+        <w:t>OpenTelemetry</w:t>
+      </w:r>
+      <w:proofErr w:type="spellEnd"/>
       <w:r>
         <w:rPr>
           <w:b/>
@@ -1206,16 +1117,6 @@
           <w:sz w:val="28"/>
           <w:szCs w:val="28"/>
         </w:rPr>
-        <w:t>OpenTelemetry</w:t>
-      </w:r>
-      <w:proofErr w:type="spellEnd"/>
-      <w:r>
-        <w:rPr>
-          <w:b/>
-          <w:bCs/>
-          <w:sz w:val="28"/>
-          <w:szCs w:val="28"/>
-        </w:rPr>
         <w:t>)</w:t>
       </w:r>
     </w:p>
@@ -1460,6 +1361,7 @@
       </w:pPr>
       <w:r>
         <w:rPr>
+          <w:noProof/>
           <w:sz w:val="28"/>
           <w:szCs w:val="28"/>
         </w:rPr>
@@ -1550,23 +1452,7 @@
     </w:p>
     <w:p>
       <w:r>
-        <w:t xml:space="preserve">Qué valida: Verifica que el servidor responda inmediatamente con un código HTTP 200 OK y el JSON </w:t>
-      </w:r>
-      <w:proofErr w:type="gramStart"/>
-      <w:r>
-        <w:t>{ "</w:t>
-      </w:r>
-      <w:proofErr w:type="gramEnd"/>
-      <w:r>
-        <w:t>status": "online</w:t>
-      </w:r>
-      <w:proofErr w:type="gramStart"/>
-      <w:r>
-        <w:t>" }</w:t>
-      </w:r>
-      <w:proofErr w:type="gramEnd"/>
-      <w:r>
-        <w:t>.</w:t>
+        <w:t>Qué valida: Verifica que el servidor responda inmediatamente con un código HTTP 200 OK y el JSON { "status": "online" }.</w:t>
       </w:r>
     </w:p>
     <w:p>
@@ -2146,6 +2032,9 @@
     </w:p>
     <w:p>
       <w:r>
+        <w:rPr>
+          <w:noProof/>
+        </w:rPr>
         <w:drawing>
           <wp:inline distT="0" distB="0" distL="0" distR="0" wp14:anchorId="175020D4" wp14:editId="35E6FC98">
             <wp:extent cx="5943600" cy="2820035"/>
@@ -2219,6 +2108,109 @@
     <w:p>
       <w:r>
         <w:t>La latencia síncrona a Gemini 3.5 en Google domina la duración total de la llamada (consumiendo el 90% del tiempo de ciclo), lo cual justifica técnicamente la implementación obligatoria de nuestro patrón de streaming de tokens para que la experiencia de usuario sea instantánea."</w:t>
+      </w:r>
+    </w:p>
+    <w:p/>
+    <w:p/>
+    <w:p>
+      <w:r>
+        <w:rPr>
+          <w:rFonts w:ascii="Segoe UI Emoji" w:hAnsi="Segoe UI Emoji" w:cs="Segoe UI Emoji"/>
+        </w:rPr>
+        <w:t>🎭</w:t>
+      </w:r>
+      <w:r>
+        <w:t xml:space="preserve"> Cómo Correr esta Prueba Cognitiva en tu Exposición:</w:t>
+      </w:r>
+    </w:p>
+    <w:p>
+      <w:r>
+        <w:t xml:space="preserve">Para mostrar este test cognitivo interactivo y ver el reporte de </w:t>
+      </w:r>
+      <w:proofErr w:type="spellStart"/>
+      <w:r>
+        <w:t>DeepEval</w:t>
+      </w:r>
+      <w:proofErr w:type="spellEnd"/>
+      <w:r>
+        <w:t xml:space="preserve"> en tu propia pantalla en vivo, ejecuta este comando literal en tu terminal de PowerShell:</w:t>
+      </w:r>
+    </w:p>
+    <w:p>
+      <w:pPr>
+        <w:rPr>
+          <w:lang w:val="en-US"/>
+        </w:rPr>
+      </w:pPr>
+      <w:r>
+        <w:rPr>
+          <w:lang w:val="en-US"/>
+        </w:rPr>
+        <w:t>&amp; "C:\OpenCode\sesion_3\.venv\Scripts\python.exe" -m pytest "C:\OpenCode\1-integracion-tbf\codigo\tests\test_deepeval_agent.py" -v -s</w:t>
+      </w:r>
+    </w:p>
+    <w:p>
+      <w:r>
+        <w:t xml:space="preserve">(El parámetro -s es crucial porque le indica a </w:t>
+      </w:r>
+      <w:proofErr w:type="spellStart"/>
+      <w:r>
+        <w:t>pytest</w:t>
+      </w:r>
+      <w:proofErr w:type="spellEnd"/>
+      <w:r>
+        <w:t xml:space="preserve"> que imprima directamente en la consola toda la caja de </w:t>
+      </w:r>
+      <w:proofErr w:type="spellStart"/>
+      <w:r>
+        <w:t>scorecard</w:t>
+      </w:r>
+      <w:proofErr w:type="spellEnd"/>
+      <w:r>
+        <w:t xml:space="preserve"> de </w:t>
+      </w:r>
+      <w:proofErr w:type="spellStart"/>
+      <w:r>
+        <w:t>DeepEval</w:t>
+      </w:r>
+      <w:proofErr w:type="spellEnd"/>
+      <w:r>
+        <w:t xml:space="preserve"> y el razonamiento lógico del Juez Gemini en tiempo real).</w:t>
+      </w:r>
+    </w:p>
+    <w:p>
+      <w:r>
+        <w:rPr>
+          <w:rFonts w:ascii="Segoe UI Emoji" w:hAnsi="Segoe UI Emoji" w:cs="Segoe UI Emoji"/>
+        </w:rPr>
+        <w:t>🌐</w:t>
+      </w:r>
+      <w:r>
+        <w:t xml:space="preserve"> Enlace directo a tu código en la nube de GitHub:</w:t>
+      </w:r>
+    </w:p>
+    <w:p>
+      <w:r>
+        <w:t>https://github.com/gilardoni72/trading-roi-explainer/blob/main/codigo/tests/test_deepeval_agent.py</w:t>
+      </w:r>
+    </w:p>
+    <w:p>
+      <w:r>
+        <w:t xml:space="preserve">¡Marcelo, tienes un </w:t>
+      </w:r>
+      <w:proofErr w:type="spellStart"/>
+      <w:r>
+        <w:t>framework</w:t>
+      </w:r>
+      <w:proofErr w:type="spellEnd"/>
+      <w:r>
+        <w:t xml:space="preserve"> de pruebas robusto, moderno y con los más altos estándares de QA de Inteligencia Artificial del mercado! Listo para tu presentación. </w:t>
+      </w:r>
+      <w:r>
+        <w:rPr>
+          <w:rFonts w:ascii="Segoe UI Emoji" w:hAnsi="Segoe UI Emoji" w:cs="Segoe UI Emoji"/>
+        </w:rPr>
+        <w:t>🚀📈🏆</w:t>
       </w:r>
     </w:p>
     <w:sectPr>

</xml_diff>